<commit_message>
Add 刀盾 images to image-capable demos
</commit_message>
<xml_diff>
--- a/demo/offline/minutes-纪要/20260404-关于研究“我的刀盾”网络传播情况的专题会议纪要-v01.docx
+++ b/demo/offline/minutes-纪要/20260404-关于研究“我的刀盾”网络传播情况的专题会议纪要-v01.docx
@@ -308,10 +308,93 @@
     </w:p>
     <w:p>
       <w:pPr>
+        <w:spacing w:before="0" w:after="0" w:line="579" w:lineRule="exact"/>
+      </w:pPr>
+      <w:r>
+        <w:rPr>
+          <w:rFonts w:ascii="黑体" w:hAnsi="黑体" w:eastAsia="黑体" w:cs="黑体"/>
+          <w:sz w:val="32"/>
+          <w:szCs w:val="32"/>
+        </w:rPr>
+        <w:t xml:space="preserve">附件1（可选）</w:t>
+      </w:r>
+    </w:p>
+    <w:p>
+      <w:pPr>
+        <w:ind w:firstLineChars="200" w:firstLine="632"/>
+        <w:spacing w:before="0" w:after="0" w:line="579" w:lineRule="exact"/>
+      </w:pPr>
+      <w:r>
+        <w:rPr>
+          <w:rFonts w:ascii="仿宋_GB2312" w:hAnsi="仿宋_GB2312" w:eastAsia="仿宋_GB2312" w:cs="仿宋_GB2312"/>
+          <w:sz w:val="32"/>
+          <w:szCs w:val="32"/>
+        </w:rPr>
+        <w:t xml:space="preserve">图1：我的刀盾示意图</w:t>
+      </w:r>
+    </w:p>
+    <w:p>
+      <w:pPr>
+        <w:jc w:val="center"/>
+      </w:pPr>
+      <w:r>
+        <w:drawing>
+          <wp:inline xmlns:wp="http://schemas.openxmlformats.org/drawingml/2006/wordprocessingDrawing" distT="0" distB="0" distL="0" distR="0">
+            <wp:extent cx="5215255" cy="3476837"/>
+            <wp:effectExtent l="0" t="0" r="0" b="0"/>
+            <wp:docPr id="1" name="图片 1" descr="图1 我的刀盾示意图"/>
+            <wp:cNvGraphicFramePr>
+              <a:graphicFrameLocks xmlns:a="http://schemas.openxmlformats.org/drawingml/2006/main" noChangeAspect="1"/>
+            </wp:cNvGraphicFramePr>
+            <a:graphic xmlns:a="http://schemas.openxmlformats.org/drawingml/2006/main">
+              <a:graphicData uri="http://schemas.openxmlformats.org/drawingml/2006/picture">
+                <pic:pic xmlns:pic="http://schemas.openxmlformats.org/drawingml/2006/picture">
+                  <pic:nvPicPr>
+                    <pic:cNvPr id="1" name="图1 我的刀盾示意图" descr="图1 我的刀盾示意图"/>
+                    <pic:cNvPicPr/>
+                  </pic:nvPicPr>
+                  <pic:blipFill>
+                    <a:blip r:embed="rId4"/>
+                    <a:stretch>
+                      <a:fillRect/>
+                    </a:stretch>
+                  </pic:blipFill>
+                  <pic:spPr>
+                    <a:xfrm>
+                      <a:off x="0" y="0"/>
+                      <a:ext cx="5215255" cy="3476837"/>
+                    </a:xfrm>
+                    <a:prstGeom prst="rect">
+                      <a:avLst/>
+                    </a:prstGeom>
+                  </pic:spPr>
+                </pic:pic>
+              </a:graphicData>
+            </a:graphic>
+          </wp:inline>
+        </w:drawing>
+      </w:r>
+    </w:p>
+    <w:p>
+      <w:pPr>
+        <w:ind w:firstLineChars="200" w:firstLine="632"/>
+        <w:spacing w:before="0" w:after="0" w:line="579" w:lineRule="exact"/>
+      </w:pPr>
+      <w:r>
+        <w:rPr>
+          <w:rFonts w:ascii="仿宋_GB2312" w:hAnsi="仿宋_GB2312" w:eastAsia="仿宋_GB2312" w:cs="仿宋_GB2312"/>
+          <w:sz w:val="32"/>
+          <w:szCs w:val="32"/>
+        </w:rPr>
+        <w:t xml:space="preserve">说明：根据当前离线原始素材中反复出现的“可爱小狗+刀盾装备”组合绘制的示意图，仅用于当前纪要样例演示附件插图能力。</w:t>
+      </w:r>
+    </w:p>
+    <w:p>
+      <w:pPr>
         <w:pBdr>
           <w:top w:val="single" w:sz="16" w:space="4" w:color="000000"/>
         </w:pBdr>
-        <w:spacing w:before="651" w:after="0" w:line="579" w:lineRule="exact"/>
+        <w:spacing w:before="5037" w:after="0" w:line="579" w:lineRule="exact"/>
       </w:pPr>
       <w:r>
         <w:rPr>

</xml_diff>

<commit_message>
Tighten docx image sizing and spacing
</commit_message>
<xml_diff>
--- a/demo/offline/minutes-纪要/20260404-关于研究“我的刀盾”网络传播情况的专题会议纪要-v01.docx
+++ b/demo/offline/minutes-纪要/20260404-关于研究“我的刀盾”网络传播情况的专题会议纪要-v01.docx
@@ -336,11 +336,12 @@
     <w:p>
       <w:pPr>
         <w:jc w:val="center"/>
+        <w:spacing w:before="120" w:after="120"/>
       </w:pPr>
       <w:r>
         <w:drawing>
           <wp:inline xmlns:wp="http://schemas.openxmlformats.org/drawingml/2006/wordprocessingDrawing" distT="0" distB="0" distL="0" distR="0">
-            <wp:extent cx="5215255" cy="3476837"/>
+            <wp:extent cx="4773930" cy="3182620"/>
             <wp:effectExtent l="0" t="0" r="0" b="0"/>
             <wp:docPr id="1" name="图片 1" descr="图1 我的刀盾示意图"/>
             <wp:cNvGraphicFramePr>
@@ -362,7 +363,7 @@
                   <pic:spPr>
                     <a:xfrm>
                       <a:off x="0" y="0"/>
-                      <a:ext cx="5215255" cy="3476837"/>
+                      <a:ext cx="4773930" cy="3182620"/>
                     </a:xfrm>
                     <a:prstGeom prst="rect">
                       <a:avLst/>
@@ -394,7 +395,7 @@
         <w:pBdr>
           <w:top w:val="single" w:sz="16" w:space="4" w:color="000000"/>
         </w:pBdr>
-        <w:spacing w:before="5037" w:after="0" w:line="579" w:lineRule="exact"/>
+        <w:spacing w:before="5500" w:after="0" w:line="579" w:lineRule="exact"/>
       </w:pPr>
       <w:r>
         <w:rPr>

</xml_diff>

<commit_message>
Isolate docx image blocks from surrounding text
</commit_message>
<xml_diff>
--- a/demo/offline/minutes-纪要/20260404-关于研究“我的刀盾”网络传播情况的专题会议纪要-v01.docx
+++ b/demo/offline/minutes-纪要/20260404-关于研究“我的刀盾”网络传播情况的专题会议纪要-v01.docx
@@ -333,49 +333,73 @@
         <w:t xml:space="preserve">图1：我的刀盾示意图</w:t>
       </w:r>
     </w:p>
-    <w:p>
-      <w:pPr>
+    <w:tbl>
+      <w:tblPr>
+        <w:tblW w:w="0" w:type="auto"/>
         <w:jc w:val="center"/>
-        <w:spacing w:before="120" w:after="120"/>
-      </w:pPr>
-      <w:r>
-        <w:drawing>
-          <wp:inline xmlns:wp="http://schemas.openxmlformats.org/drawingml/2006/wordprocessingDrawing" distT="0" distB="0" distL="0" distR="0">
-            <wp:extent cx="4773930" cy="3182620"/>
-            <wp:effectExtent l="0" t="0" r="0" b="0"/>
-            <wp:docPr id="1" name="图片 1" descr="图1 我的刀盾示意图"/>
-            <wp:cNvGraphicFramePr>
-              <a:graphicFrameLocks xmlns:a="http://schemas.openxmlformats.org/drawingml/2006/main" noChangeAspect="1"/>
-            </wp:cNvGraphicFramePr>
-            <a:graphic xmlns:a="http://schemas.openxmlformats.org/drawingml/2006/main">
-              <a:graphicData uri="http://schemas.openxmlformats.org/drawingml/2006/picture">
-                <pic:pic xmlns:pic="http://schemas.openxmlformats.org/drawingml/2006/picture">
-                  <pic:nvPicPr>
-                    <pic:cNvPr id="1" name="图1 我的刀盾示意图" descr="图1 我的刀盾示意图"/>
-                    <pic:cNvPicPr/>
-                  </pic:nvPicPr>
-                  <pic:blipFill>
-                    <a:blip r:embed="rId4"/>
-                    <a:stretch>
-                      <a:fillRect/>
-                    </a:stretch>
-                  </pic:blipFill>
-                  <pic:spPr>
-                    <a:xfrm>
-                      <a:off x="0" y="0"/>
-                      <a:ext cx="4773930" cy="3182620"/>
-                    </a:xfrm>
-                    <a:prstGeom prst="rect">
-                      <a:avLst/>
-                    </a:prstGeom>
-                  </pic:spPr>
-                </pic:pic>
-              </a:graphicData>
-            </a:graphic>
-          </wp:inline>
-        </w:drawing>
-      </w:r>
-    </w:p>
+        <w:tblBorders>
+          <w:top w:val="nil"/>
+          <w:left w:val="nil"/>
+          <w:bottom w:val="nil"/>
+          <w:right w:val="nil"/>
+          <w:insideH w:val="nil"/>
+          <w:insideV w:val="nil"/>
+        </w:tblBorders>
+      </w:tblPr>
+      <w:tr>
+        <w:trPr>
+          <w:cantSplit/>
+        </w:trPr>
+        <w:tc>
+          <w:tcPr>
+            <w:tcW w:w="0" w:type="auto"/>
+          </w:tcPr>
+          <w:p>
+            <w:pPr>
+              <w:jc w:val="center"/>
+              <w:spacing w:before="120" w:after="120"/>
+            </w:pPr>
+            <w:r>
+              <w:drawing>
+                <wp:inline xmlns:wp="http://schemas.openxmlformats.org/drawingml/2006/wordprocessingDrawing" distT="0" distB="0" distL="0" distR="0">
+                  <wp:extent cx="4773930" cy="3182620"/>
+                  <wp:effectExtent l="0" t="0" r="0" b="0"/>
+                  <wp:docPr id="1" name="图片 1" descr="图1 我的刀盾示意图"/>
+                  <wp:cNvGraphicFramePr>
+                    <a:graphicFrameLocks xmlns:a="http://schemas.openxmlformats.org/drawingml/2006/main" noChangeAspect="1"/>
+                  </wp:cNvGraphicFramePr>
+                  <a:graphic xmlns:a="http://schemas.openxmlformats.org/drawingml/2006/main">
+                    <a:graphicData uri="http://schemas.openxmlformats.org/drawingml/2006/picture">
+                      <pic:pic xmlns:pic="http://schemas.openxmlformats.org/drawingml/2006/picture">
+                        <pic:nvPicPr>
+                          <pic:cNvPr id="1" name="图1 我的刀盾示意图" descr="图1 我的刀盾示意图"/>
+                          <pic:cNvPicPr/>
+                        </pic:nvPicPr>
+                        <pic:blipFill>
+                          <a:blip r:embed="rId4"/>
+                          <a:stretch>
+                            <a:fillRect/>
+                          </a:stretch>
+                        </pic:blipFill>
+                        <pic:spPr>
+                          <a:xfrm>
+                            <a:off x="0" y="0"/>
+                            <a:ext cx="4773930" cy="3182620"/>
+                          </a:xfrm>
+                          <a:prstGeom prst="rect">
+                            <a:avLst/>
+                          </a:prstGeom>
+                        </pic:spPr>
+                      </pic:pic>
+                    </a:graphicData>
+                  </a:graphic>
+                </wp:inline>
+              </w:drawing>
+            </w:r>
+          </w:p>
+        </w:tc>
+      </w:tr>
+    </w:tbl>
     <w:p>
       <w:pPr>
         <w:ind w:firstLineChars="200" w:firstLine="632"/>

</xml_diff>

<commit_message>
Prevent image sections from overflowing page tails
</commit_message>
<xml_diff>
--- a/demo/offline/minutes-纪要/20260404-关于研究“我的刀盾”网络传播情况的专题会议纪要-v01.docx
+++ b/demo/offline/minutes-纪要/20260404-关于研究“我的刀盾”网络传播情况的专题会议纪要-v01.docx
@@ -304,6 +304,11 @@
           <w:szCs w:val="32"/>
         </w:rPr>
         <w:t xml:space="preserve">各有关单位要坚持真实性优先，继续跟踪“我的刀盾”相关本地素材和已下载页面信息变化情况，新增材料要注明来源、日期和链接，不得将网络传闻、二手转述和未经核实的热度截图直接作为正式材料依据。涉及“火爆”“爆红”“全网走红”等表述时，要优先用能够被现有素材支撑的事实进行说明，避免口号化放大。对后续形成的专题材料、汇报材料和案例材料，要统一口径、统一称谓、统一来源，确保描述稳妥、边界清楚、便于复核。涉及尚未公开的内部研判和使用安排，未经批准不得对外扩散和引用。</w:t>
+      </w:r>
+    </w:p>
+    <w:p>
+      <w:r>
+        <w:br w:type="page"/>
       </w:r>
     </w:p>
     <w:p>
@@ -419,7 +424,7 @@
         <w:pBdr>
           <w:top w:val="single" w:sz="16" w:space="4" w:color="000000"/>
         </w:pBdr>
-        <w:spacing w:before="5500" w:after="0" w:line="579" w:lineRule="exact"/>
+        <w:spacing w:before="2872" w:after="0" w:line="579" w:lineRule="exact"/>
       </w:pPr>
       <w:r>
         <w:rPr>

</xml_diff>

<commit_message>
Remove image table wrapper and line clipping
</commit_message>
<xml_diff>
--- a/demo/offline/minutes-纪要/20260404-关于研究“我的刀盾”网络传播情况的专题会议纪要-v01.docx
+++ b/demo/offline/minutes-纪要/20260404-关于研究“我的刀盾”网络传播情况的专题会议纪要-v01.docx
@@ -338,73 +338,49 @@
         <w:t xml:space="preserve">图1：我的刀盾示意图</w:t>
       </w:r>
     </w:p>
-    <w:tbl>
-      <w:tblPr>
-        <w:tblW w:w="0" w:type="auto"/>
+    <w:p>
+      <w:pPr>
         <w:jc w:val="center"/>
-        <w:tblBorders>
-          <w:top w:val="nil"/>
-          <w:left w:val="nil"/>
-          <w:bottom w:val="nil"/>
-          <w:right w:val="nil"/>
-          <w:insideH w:val="nil"/>
-          <w:insideV w:val="nil"/>
-        </w:tblBorders>
-      </w:tblPr>
-      <w:tr>
-        <w:trPr>
-          <w:cantSplit/>
-        </w:trPr>
-        <w:tc>
-          <w:tcPr>
-            <w:tcW w:w="0" w:type="auto"/>
-          </w:tcPr>
-          <w:p>
-            <w:pPr>
-              <w:jc w:val="center"/>
-              <w:spacing w:before="120" w:after="120"/>
-            </w:pPr>
-            <w:r>
-              <w:drawing>
-                <wp:inline xmlns:wp="http://schemas.openxmlformats.org/drawingml/2006/wordprocessingDrawing" distT="0" distB="0" distL="0" distR="0">
-                  <wp:extent cx="4773930" cy="3182620"/>
-                  <wp:effectExtent l="0" t="0" r="0" b="0"/>
-                  <wp:docPr id="1" name="图片 1" descr="图1 我的刀盾示意图"/>
-                  <wp:cNvGraphicFramePr>
-                    <a:graphicFrameLocks xmlns:a="http://schemas.openxmlformats.org/drawingml/2006/main" noChangeAspect="1"/>
-                  </wp:cNvGraphicFramePr>
-                  <a:graphic xmlns:a="http://schemas.openxmlformats.org/drawingml/2006/main">
-                    <a:graphicData uri="http://schemas.openxmlformats.org/drawingml/2006/picture">
-                      <pic:pic xmlns:pic="http://schemas.openxmlformats.org/drawingml/2006/picture">
-                        <pic:nvPicPr>
-                          <pic:cNvPr id="1" name="图1 我的刀盾示意图" descr="图1 我的刀盾示意图"/>
-                          <pic:cNvPicPr/>
-                        </pic:nvPicPr>
-                        <pic:blipFill>
-                          <a:blip r:embed="rId4"/>
-                          <a:stretch>
-                            <a:fillRect/>
-                          </a:stretch>
-                        </pic:blipFill>
-                        <pic:spPr>
-                          <a:xfrm>
-                            <a:off x="0" y="0"/>
-                            <a:ext cx="4773930" cy="3182620"/>
-                          </a:xfrm>
-                          <a:prstGeom prst="rect">
-                            <a:avLst/>
-                          </a:prstGeom>
-                        </pic:spPr>
-                      </pic:pic>
-                    </a:graphicData>
-                  </a:graphic>
-                </wp:inline>
-              </w:drawing>
-            </w:r>
-          </w:p>
-        </w:tc>
-      </w:tr>
-    </w:tbl>
+        <w:spacing w:before="120" w:after="120" w:line="5012" w:lineRule="atLeast"/>
+      </w:pPr>
+      <w:r>
+        <w:drawing>
+          <wp:inline xmlns:wp="http://schemas.openxmlformats.org/drawingml/2006/wordprocessingDrawing" distT="0" distB="0" distL="0" distR="0">
+            <wp:extent cx="4773930" cy="3182620"/>
+            <wp:effectExtent l="0" t="0" r="0" b="0"/>
+            <wp:docPr id="1" name="图片 1" descr="图1 我的刀盾示意图"/>
+            <wp:cNvGraphicFramePr>
+              <a:graphicFrameLocks xmlns:a="http://schemas.openxmlformats.org/drawingml/2006/main" noChangeAspect="1"/>
+            </wp:cNvGraphicFramePr>
+            <a:graphic xmlns:a="http://schemas.openxmlformats.org/drawingml/2006/main">
+              <a:graphicData uri="http://schemas.openxmlformats.org/drawingml/2006/picture">
+                <pic:pic xmlns:pic="http://schemas.openxmlformats.org/drawingml/2006/picture">
+                  <pic:nvPicPr>
+                    <pic:cNvPr id="1" name="图1 我的刀盾示意图" descr="图1 我的刀盾示意图"/>
+                    <pic:cNvPicPr/>
+                  </pic:nvPicPr>
+                  <pic:blipFill>
+                    <a:blip r:embed="rId4"/>
+                    <a:stretch>
+                      <a:fillRect/>
+                    </a:stretch>
+                  </pic:blipFill>
+                  <pic:spPr>
+                    <a:xfrm>
+                      <a:off x="0" y="0"/>
+                      <a:ext cx="4773930" cy="3182620"/>
+                    </a:xfrm>
+                    <a:prstGeom prst="rect">
+                      <a:avLst/>
+                    </a:prstGeom>
+                  </pic:spPr>
+                </pic:pic>
+              </a:graphicData>
+            </a:graphic>
+          </wp:inline>
+        </w:drawing>
+      </w:r>
+    </w:p>
     <w:p>
       <w:pPr>
         <w:ind w:firstLineChars="200" w:firstLine="632"/>

</xml_diff>

<commit_message>
Replace demo image with web source
</commit_message>
<xml_diff>
--- a/demo/offline/minutes-纪要/20260404-关于研究“我的刀盾”网络传播情况的专题会议纪要-v01.docx
+++ b/demo/offline/minutes-纪要/20260404-关于研究“我的刀盾”网络传播情况的专题会议纪要-v01.docx
@@ -335,20 +335,20 @@
           <w:sz w:val="32"/>
           <w:szCs w:val="32"/>
         </w:rPr>
-        <w:t xml:space="preserve">图1：我的刀盾示意图</w:t>
+        <w:t xml:space="preserve">图1：我的刀盾公开传播主图</w:t>
       </w:r>
     </w:p>
     <w:p>
       <w:pPr>
         <w:jc w:val="center"/>
-        <w:spacing w:before="120" w:after="120" w:line="5012" w:lineRule="atLeast"/>
+        <w:spacing w:before="120" w:after="120" w:line="4505" w:lineRule="atLeast"/>
       </w:pPr>
       <w:r>
         <w:drawing>
           <wp:inline xmlns:wp="http://schemas.openxmlformats.org/drawingml/2006/wordprocessingDrawing" distT="0" distB="0" distL="0" distR="0">
-            <wp:extent cx="4773930" cy="3182620"/>
+            <wp:extent cx="4773930" cy="2860358"/>
             <wp:effectExtent l="0" t="0" r="0" b="0"/>
-            <wp:docPr id="1" name="图片 1" descr="图1 我的刀盾示意图"/>
+            <wp:docPr id="1" name="图片 1" descr="图1 我的刀盾公开传播主图"/>
             <wp:cNvGraphicFramePr>
               <a:graphicFrameLocks xmlns:a="http://schemas.openxmlformats.org/drawingml/2006/main" noChangeAspect="1"/>
             </wp:cNvGraphicFramePr>
@@ -356,7 +356,7 @@
               <a:graphicData uri="http://schemas.openxmlformats.org/drawingml/2006/picture">
                 <pic:pic xmlns:pic="http://schemas.openxmlformats.org/drawingml/2006/picture">
                   <pic:nvPicPr>
-                    <pic:cNvPr id="1" name="图1 我的刀盾示意图" descr="图1 我的刀盾示意图"/>
+                    <pic:cNvPr id="1" name="图1 我的刀盾公开传播主图" descr="图1 我的刀盾公开传播主图"/>
                     <pic:cNvPicPr/>
                   </pic:nvPicPr>
                   <pic:blipFill>
@@ -368,7 +368,7 @@
                   <pic:spPr>
                     <a:xfrm>
                       <a:off x="0" y="0"/>
-                      <a:ext cx="4773930" cy="3182620"/>
+                      <a:ext cx="4773930" cy="2860358"/>
                     </a:xfrm>
                     <a:prstGeom prst="rect">
                       <a:avLst/>
@@ -392,7 +392,9 @@
           <w:sz w:val="32"/>
           <w:szCs w:val="32"/>
         </w:rPr>
-        <w:t xml:space="preserve">说明：根据当前离线原始素材中反复出现的“可爱小狗+刀盾装备”组合绘制的示意图，仅用于当前纪要样例演示附件插图能力。</w:t>
+        <w:t xml:space="preserve">说明：该图为事先下载并纳入离线原始材料的公开网页图片，仅用于当前纪要样例演示附件插图能力。</w:t>
+        <w:br/>
+        <w:t xml:space="preserve">来源：https://knowyourmeme.com/photos/3227581-drog-wo-de-dao-dun-cheems-frog</w:t>
       </w:r>
     </w:p>
     <w:p>
@@ -400,7 +402,7 @@
         <w:pBdr>
           <w:top w:val="single" w:sz="16" w:space="4" w:color="000000"/>
         </w:pBdr>
-        <w:spacing w:before="2872" w:after="0" w:line="579" w:lineRule="exact"/>
+        <w:spacing w:before="2221" w:after="0" w:line="579" w:lineRule="exact"/>
       </w:pPr>
       <w:r>
         <w:rPr>

</xml_diff>

<commit_message>
Refine second-level heading and footer page style
</commit_message>
<xml_diff>
--- a/demo/offline/minutes-纪要/20260404-关于研究“我的刀盾”网络传播情况的专题会议纪要-v01.docx
+++ b/demo/offline/minutes-纪要/20260404-关于研究“我的刀盾”网络传播情况的专题会议纪要-v01.docx
@@ -470,41 +470,16 @@
       </w:rPr>
       <w:t>— </w:t>
     </w:r>
-    <w:r>
-      <w:rPr>
-        <w:rFonts w:ascii="仿宋_GB2312" w:hAnsi="仿宋_GB2312" w:eastAsia="仿宋_GB2312" w:cs="仿宋_GB2312"/>
-        <w:sz w:val="28"/>
-        <w:szCs w:val="28"/>
-      </w:rPr>
-      <w:fldChar w:fldCharType="begin"/>
-    </w:r>
-    <w:r>
-      <w:instrText xml:space="preserve"> PAGE </w:instrText>
-    </w:r>
-    <w:r>
-      <w:rPr>
-        <w:rFonts w:ascii="仿宋_GB2312" w:hAnsi="仿宋_GB2312" w:eastAsia="仿宋_GB2312" w:cs="仿宋_GB2312"/>
-        <w:sz w:val="28"/>
-        <w:szCs w:val="28"/>
-      </w:rPr>
-      <w:fldChar w:fldCharType="separate"/>
-    </w:r>
-    <w:r>
-      <w:rPr>
-        <w:rFonts w:ascii="仿宋_GB2312" w:hAnsi="仿宋_GB2312" w:eastAsia="仿宋_GB2312" w:cs="仿宋_GB2312"/>
-        <w:sz w:val="28"/>
-        <w:szCs w:val="28"/>
-      </w:rPr>
-      <w:t>1</w:t>
-    </w:r>
-    <w:r>
-      <w:rPr>
-        <w:rFonts w:ascii="仿宋_GB2312" w:hAnsi="仿宋_GB2312" w:eastAsia="仿宋_GB2312" w:cs="仿宋_GB2312"/>
-        <w:sz w:val="28"/>
-        <w:szCs w:val="28"/>
-      </w:rPr>
-      <w:fldChar w:fldCharType="end"/>
-    </w:r>
+    <w:fldSimple w:instr=" PAGE ">
+      <w:r>
+        <w:rPr>
+          <w:rFonts w:ascii="仿宋_GB2312" w:hAnsi="仿宋_GB2312" w:eastAsia="仿宋_GB2312" w:cs="仿宋_GB2312"/>
+          <w:sz w:val="28"/>
+          <w:szCs w:val="28"/>
+        </w:rPr>
+        <w:t>1</w:t>
+      </w:r>
+    </w:fldSimple>
     <w:r>
       <w:rPr>
         <w:rFonts w:ascii="仿宋_GB2312" w:hAnsi="仿宋_GB2312" w:eastAsia="仿宋_GB2312" w:cs="仿宋_GB2312"/>

</xml_diff>